<commit_message>
Add xray llm sections and WAF document-only review flow
</commit_message>
<xml_diff>
--- a/templates/xray_inspection_report.docx
+++ b/templates/xray_inspection_report.docx
@@ -2513,39 +2513,14 @@
         </ns0:rPr>
       </ns0:pPr>
       <ns0:r>
-        <ns0:rPr>
-          <ns0:b/>
-          <ns0:bCs/>
-          <ns0:sz ns0:val="32"/>
-          <ns0:szCs ns0:val="40"/>
-        </ns0:rPr>
-        <ns0:t>四、</ns0:t>
-      </ns0:r>
-      <ns0:r>
-        <ns0:rPr>
-          <ns0:rFonts ns0:hint="eastAsia"/>
-          <ns0:b/>
-          <ns0:bCs/>
-          <ns0:sz ns0:val="32"/>
-          <ns0:szCs ns0:val="40"/>
-          <ns0:lang ns0:val="en-US" ns0:eastAsia="zh-CN"/>
-        </ns0:rPr>
-        <ns0:t>巡检结论</ns0:t>
-      </ns0:r>
-      <ns0:r>
-        <ns0:rPr>
-          <ns0:b/>
-          <ns0:bCs/>
-          <ns0:sz ns0:val="32"/>
-          <ns0:szCs ns0:val="40"/>
-        </ns0:rPr>
-        <ns0:t>与处置建议</ns0:t>
+        <ns0:rPr/>
+        <ns0:t>四、异常情况及处置操作</ns0:t>
       </ns0:r>
     </ns0:p>
     <ns0:p ns2:paraId="7FC0E1E9">
       <ns0:r>
         <ns0:rPr/>
-        <ns0:t>巡检结论：{d.appendix.xray_result_conclusion}</ns0:t>
+        <ns0:t>（按风险优先级排序）</ns0:t>
       </ns0:r>
     </ns0:p>
     <ns0:p ns2:paraId="05FC1F47">
@@ -2557,13 +2532,13 @@
       </ns0:pPr>
       <ns0:r>
         <ns0:rPr/>
-        <ns0:t>重点告警：{d.appendix.xray_key_alerts}</ns0:t>
+        <ns0:t/>
       </ns0:r>
     </ns0:p>
     <ns0:p ns2:paraId="6A995AFE">
       <ns0:r>
         <ns0:rPr/>
-        <ns0:t>关键运行概况：{d.appendix.xray_key_runtime_overview}</ns0:t>
+        <ns0:t/>
       </ns0:r>
     </ns0:p>
     <ns0:p ns2:paraId="58FA3DA5">
@@ -2586,7 +2561,8 @@
         </ns0:rPr>
       </ns0:pPr>
       <ns0:r>
-        <ns0:t>问题 - 证据 - 建议（按风险优先级排序）</ns0:t>
+        <ns0:rPr/>
+        <ns0:t>{d.appendix.xray_display_issue_1_problem_line}</ns0:t>
       </ns0:r>
     </ns0:p>
     <ns0:p ns2:paraId="1398C895">
@@ -2601,7 +2577,8 @@
         </ns0:rPr>
       </ns0:pPr>
       <ns0:r>
-        <ns0:t>说明：以下问题按照“重启/健康检查告警 &gt; 服务/容器异常 &gt; 资源风险 &gt; 其他观察”排序展示。</ns0:t>
+        <ns0:rPr/>
+        <ns0:t>{d.appendix.xray_display_issue_1_evidence_line}</ns0:t>
       </ns0:r>
     </ns0:p>
     <ns0:p ns2:paraId="1FD8E959">
@@ -2613,7 +2590,7 @@
       </ns0:pPr>
       <ns0:r>
         <ns0:rPr/>
-        <ns0:t>问题 1：{d.appendix.xray_issue_1_problem}</ns0:t>
+        <ns0:t>{d.appendix.xray_display_issue_1_action_line}</ns0:t>
       </ns0:r>
     </ns0:p>
     <ns0:p ns2:paraId="4DFC79D7">
@@ -2625,7 +2602,7 @@
       </ns0:pPr>
       <ns0:r>
         <ns0:rPr/>
-        <ns0:t>证据：{d.appendix.xray_issue_1_evidence}</ns0:t>
+        <ns0:t/>
       </ns0:r>
     </ns0:p>
     <ns0:p ns2:paraId="6C84A487">
@@ -2637,7 +2614,7 @@
       </ns0:pPr>
       <ns0:r>
         <ns0:rPr/>
-        <ns0:t>建议：{d.appendix.xray_issue_1_recommendation}</ns0:t>
+        <ns0:t>{d.appendix.xray_display_issue_2_problem_line}</ns0:t>
       </ns0:r>
     </ns0:p>
     <ns0:p ns2:paraId="4DF1EDAB">
@@ -2647,6 +2624,10 @@
           <ns0:lang ns0:val="en-US" ns0:eastAsia="zh-CN"/>
         </ns0:rPr>
       </ns0:pPr>
+      <ns0:r>
+        <ns0:rPr/>
+        <ns0:t>{d.appendix.xray_display_issue_2_evidence_line}</ns0:t>
+      </ns0:r>
     </ns0:p>
     <ns0:p ns2:paraId="40D3EF86">
       <ns0:pPr>
@@ -2657,7 +2638,7 @@
       </ns0:pPr>
       <ns0:r>
         <ns0:rPr/>
-        <ns0:t>问题 2：{d.appendix.xray_issue_2_problem}</ns0:t>
+        <ns0:t>{d.appendix.xray_display_issue_2_action_line}</ns0:t>
       </ns0:r>
     </ns0:p>
     <ns0:p ns2:paraId="0AF02DA5">
@@ -2669,7 +2650,7 @@
       </ns0:pPr>
       <ns0:r>
         <ns0:rPr/>
-        <ns0:t>证据：{d.appendix.xray_issue_2_evidence}</ns0:t>
+        <ns0:t/>
       </ns0:r>
     </ns0:p>
     <ns0:p ns2:paraId="2335F176">
@@ -2681,7 +2662,7 @@
       </ns0:pPr>
       <ns0:r>
         <ns0:rPr/>
-        <ns0:t>建议：{d.appendix.xray_issue_2_recommendation}</ns0:t>
+        <ns0:t>{d.appendix.xray_display_issue_3_problem_line}</ns0:t>
       </ns0:r>
     </ns0:p>
     <ns0:p ns2:paraId="2E3ADD3A">
@@ -2691,6 +2672,10 @@
           <ns0:lang ns0:val="en-US" ns0:eastAsia="zh-CN"/>
         </ns0:rPr>
       </ns0:pPr>
+      <ns0:r>
+        <ns0:rPr/>
+        <ns0:t>{d.appendix.xray_display_issue_3_evidence_line}</ns0:t>
+      </ns0:r>
     </ns0:p>
     <ns0:p ns2:paraId="225AA07C">
       <ns0:pPr>
@@ -2701,7 +2686,7 @@
       </ns0:pPr>
       <ns0:r>
         <ns0:rPr/>
-        <ns0:t>问题 3：{d.appendix.xray_issue_3_problem}</ns0:t>
+        <ns0:t>{d.appendix.xray_display_issue_3_action_line}</ns0:t>
       </ns0:r>
     </ns0:p>
     <ns0:p ns2:paraId="45D5D491">
@@ -2713,7 +2698,7 @@
       </ns0:pPr>
       <ns0:r>
         <ns0:rPr/>
-        <ns0:t>证据：{d.appendix.xray_issue_3_evidence}</ns0:t>
+        <ns0:t/>
       </ns0:r>
     </ns0:p>
     <ns0:p ns2:paraId="6FCB48F6">
@@ -2725,7 +2710,7 @@
       </ns0:pPr>
       <ns0:r>
         <ns0:rPr/>
-        <ns0:t>建议：{d.appendix.xray_issue_3_recommendation}</ns0:t>
+        <ns0:t>巡检总结：</ns0:t>
       </ns0:r>
     </ns0:p>
     <ns0:p ns2:paraId="5DE1D6F9">
@@ -2738,7 +2723,7 @@
       </ns0:pPr>
       <ns0:r>
         <ns0:rPr/>
-        <ns0:t>巡检人：{d.appendix.xray_inspector_name}</ns0:t>
+        <ns0:t>{d.appendix.xray_llm_inspection_summary}</ns0:t>
       </ns0:r>
     </ns0:p>
     <ns0:p ns2:paraId="2F8C34A9">
@@ -2751,7 +2736,7 @@
       </ns0:pPr>
       <ns0:r>
         <ns0:rPr/>
-        <ns0:t>巡检时间：{d.appendix.xray_inspection_date}</ns0:t>
+        <ns0:t>巡检人：{d.appendix.xray_inspector_name}    巡检时间：{d.appendix.xray_inspection_date}</ns0:t>
       </ns0:r>
     </ns0:p>
     <ns0:sectPr>

</xml_diff>